<commit_message>
CV, news, new position
</commit_message>
<xml_diff>
--- a/docs/cv/CV Nagendra Tanikella prof.docx
+++ b/docs/cv/CV Nagendra Tanikella prof.docx
@@ -45,7 +45,7 @@
           <w14:ligatures w14:val="standardContextual"/>
         </w:rPr>
         <w:drawing>
-          <wp:anchor distT="0" distB="0" distL="114300" distR="54610" simplePos="0" relativeHeight="251661312" behindDoc="0" locked="0" layoutInCell="1" allowOverlap="1" wp14:anchorId="0818CAA5" wp14:editId="2EEEB9D6">
+          <wp:anchor distT="0" distB="0" distL="114300" distR="54610" simplePos="0" relativeHeight="251661312" behindDoc="0" locked="0" layoutInCell="1" allowOverlap="1" wp14:anchorId="0818CAA5" wp14:editId="4B2B297F">
             <wp:simplePos x="0" y="0"/>
             <wp:positionH relativeFrom="column">
               <wp:posOffset>4801870</wp:posOffset>
@@ -75,7 +75,7 @@
                     <a:blip r:embed="rId9" cstate="print">
                       <a:extLst>
                         <a:ext uri="{28A0092B-C50C-407E-A947-70E740481C1C}">
-                          <a14:useLocalDpi xmlns:a14="http://schemas.microsoft.com/office/drawing/2010/main" val="0"/>
+                          <a14:useLocalDpi xmlns:a14="http://schemas.microsoft.com/office/drawing/2010/main"/>
                         </a:ext>
                       </a:extLst>
                     </a:blip>
@@ -111,7 +111,7 @@
           <w14:ligatures w14:val="standardContextual"/>
         </w:rPr>
         <w:drawing>
-          <wp:anchor distT="0" distB="0" distL="114300" distR="54610" simplePos="0" relativeHeight="251660288" behindDoc="0" locked="0" layoutInCell="1" allowOverlap="1" wp14:anchorId="0C6F3200" wp14:editId="09CB4D18">
+          <wp:anchor distT="0" distB="0" distL="114300" distR="54610" simplePos="0" relativeHeight="251660288" behindDoc="0" locked="0" layoutInCell="1" allowOverlap="1" wp14:anchorId="0C6F3200" wp14:editId="529C2458">
             <wp:simplePos x="0" y="0"/>
             <wp:positionH relativeFrom="column">
               <wp:posOffset>3312935</wp:posOffset>
@@ -141,7 +141,7 @@
                     <a:blip r:embed="rId11" cstate="print">
                       <a:extLst>
                         <a:ext uri="{28A0092B-C50C-407E-A947-70E740481C1C}">
-                          <a14:useLocalDpi xmlns:a14="http://schemas.microsoft.com/office/drawing/2010/main" val="0"/>
+                          <a14:useLocalDpi xmlns:a14="http://schemas.microsoft.com/office/drawing/2010/main"/>
                         </a:ext>
                       </a:extLst>
                     </a:blip>
@@ -177,7 +177,7 @@
           <w14:ligatures w14:val="standardContextual"/>
         </w:rPr>
         <w:drawing>
-          <wp:anchor distT="0" distB="0" distL="114300" distR="54610" simplePos="0" relativeHeight="251659264" behindDoc="0" locked="0" layoutInCell="1" allowOverlap="1" wp14:anchorId="0E92F66C" wp14:editId="3AD74671">
+          <wp:anchor distT="0" distB="0" distL="114300" distR="54610" simplePos="0" relativeHeight="251659264" behindDoc="0" locked="0" layoutInCell="1" allowOverlap="1" wp14:anchorId="0E92F66C" wp14:editId="143F11D7">
             <wp:simplePos x="0" y="0"/>
             <wp:positionH relativeFrom="column">
               <wp:posOffset>1830124</wp:posOffset>
@@ -207,7 +207,7 @@
                     <a:blip r:embed="rId13" cstate="print">
                       <a:extLst>
                         <a:ext uri="{28A0092B-C50C-407E-A947-70E740481C1C}">
-                          <a14:useLocalDpi xmlns:a14="http://schemas.microsoft.com/office/drawing/2010/main" val="0"/>
+                          <a14:useLocalDpi xmlns:a14="http://schemas.microsoft.com/office/drawing/2010/main"/>
                         </a:ext>
                       </a:extLst>
                     </a:blip>
@@ -540,7 +540,7 @@
           <w14:ligatures w14:val="standardContextual"/>
         </w:rPr>
         <w:drawing>
-          <wp:anchor distT="0" distB="0" distL="114300" distR="91440" simplePos="0" relativeHeight="251672576" behindDoc="0" locked="0" layoutInCell="1" allowOverlap="1" wp14:anchorId="304B95AB" wp14:editId="7B2275C2">
+          <wp:anchor distT="0" distB="0" distL="114300" distR="91440" simplePos="0" relativeHeight="251672576" behindDoc="0" locked="0" layoutInCell="1" allowOverlap="1" wp14:anchorId="304B95AB" wp14:editId="451A125B">
             <wp:simplePos x="0" y="0"/>
             <wp:positionH relativeFrom="column">
               <wp:posOffset>6173470</wp:posOffset>
@@ -571,11 +571,11 @@
                       <a:biLevel thresh="75000"/>
                       <a:extLst>
                         <a:ext uri="{28A0092B-C50C-407E-A947-70E740481C1C}">
-                          <a14:useLocalDpi xmlns:a14="http://schemas.microsoft.com/office/drawing/2010/main" val="0"/>
+                          <a14:useLocalDpi xmlns:a14="http://schemas.microsoft.com/office/drawing/2010/main"/>
                         </a:ext>
                       </a:extLst>
                     </a:blip>
-                    <a:srcRect t="1015" b="1015"/>
+                    <a:srcRect/>
                     <a:stretch>
                       <a:fillRect/>
                     </a:stretch>
@@ -894,7 +894,7 @@
           <w14:ligatures w14:val="standardContextual"/>
         </w:rPr>
         <w:drawing>
-          <wp:anchor distT="0" distB="0" distL="45720" distR="54610" simplePos="0" relativeHeight="251663360" behindDoc="1" locked="0" layoutInCell="1" allowOverlap="1" wp14:anchorId="4325FDBD" wp14:editId="798A136F">
+          <wp:anchor distT="0" distB="0" distL="45720" distR="54610" simplePos="0" relativeHeight="251663360" behindDoc="1" locked="0" layoutInCell="1" allowOverlap="1" wp14:anchorId="4325FDBD" wp14:editId="273C0860">
             <wp:simplePos x="0" y="0"/>
             <wp:positionH relativeFrom="column">
               <wp:posOffset>12700</wp:posOffset>
@@ -920,7 +920,7 @@
                     <a:blip r:embed="rId17" cstate="print">
                       <a:extLst>
                         <a:ext uri="{28A0092B-C50C-407E-A947-70E740481C1C}">
-                          <a14:useLocalDpi xmlns:a14="http://schemas.microsoft.com/office/drawing/2010/main" val="0"/>
+                          <a14:useLocalDpi xmlns:a14="http://schemas.microsoft.com/office/drawing/2010/main"/>
                         </a:ext>
                       </a:extLst>
                     </a:blip>
@@ -1062,7 +1062,7 @@
           <w14:ligatures w14:val="standardContextual"/>
         </w:rPr>
         <w:drawing>
-          <wp:anchor distT="0" distB="0" distL="114300" distR="54610" simplePos="0" relativeHeight="251664384" behindDoc="0" locked="0" layoutInCell="1" allowOverlap="1" wp14:anchorId="3E53F755" wp14:editId="473A78B3">
+          <wp:anchor distT="0" distB="0" distL="114300" distR="54610" simplePos="0" relativeHeight="251664384" behindDoc="0" locked="0" layoutInCell="1" allowOverlap="1" wp14:anchorId="3E53F755" wp14:editId="0774CF29">
             <wp:simplePos x="0" y="0"/>
             <wp:positionH relativeFrom="column">
               <wp:posOffset>-13335</wp:posOffset>
@@ -1088,7 +1088,7 @@
                     <a:blip r:embed="rId18" cstate="print">
                       <a:extLst>
                         <a:ext uri="{28A0092B-C50C-407E-A947-70E740481C1C}">
-                          <a14:useLocalDpi xmlns:a14="http://schemas.microsoft.com/office/drawing/2010/main" val="0"/>
+                          <a14:useLocalDpi xmlns:a14="http://schemas.microsoft.com/office/drawing/2010/main"/>
                         </a:ext>
                       </a:extLst>
                     </a:blip>
@@ -1302,7 +1302,7 @@
           <w14:ligatures w14:val="standardContextual"/>
         </w:rPr>
         <w:drawing>
-          <wp:anchor distT="0" distB="0" distL="114300" distR="54610" simplePos="0" relativeHeight="251665408" behindDoc="0" locked="0" layoutInCell="1" allowOverlap="1" wp14:anchorId="269D5C2B" wp14:editId="083758E2">
+          <wp:anchor distT="0" distB="0" distL="114300" distR="54610" simplePos="0" relativeHeight="251665408" behindDoc="0" locked="0" layoutInCell="1" allowOverlap="1" wp14:anchorId="269D5C2B" wp14:editId="57C3A3EE">
             <wp:simplePos x="0" y="0"/>
             <wp:positionH relativeFrom="column">
               <wp:posOffset>-40741</wp:posOffset>
@@ -1328,7 +1328,7 @@
                     <a:blip r:embed="rId19" cstate="print">
                       <a:extLst>
                         <a:ext uri="{28A0092B-C50C-407E-A947-70E740481C1C}">
-                          <a14:useLocalDpi xmlns:a14="http://schemas.microsoft.com/office/drawing/2010/main" val="0"/>
+                          <a14:useLocalDpi xmlns:a14="http://schemas.microsoft.com/office/drawing/2010/main"/>
                         </a:ext>
                       </a:extLst>
                     </a:blip>
@@ -1424,6 +1424,7 @@
         <w:tab/>
         <w:t xml:space="preserve">    </w:t>
       </w:r>
+      <w:proofErr w:type="gramStart"/>
       <w:r>
         <w:rPr>
           <w:rFonts w:cstheme="minorHAnsi"/>
@@ -1440,7 +1441,14 @@
         <w:rPr>
           <w:rFonts w:cstheme="minorHAnsi"/>
         </w:rPr>
-        <w:t>August 2014</w:t>
+        <w:t>August</w:t>
+      </w:r>
+      <w:proofErr w:type="gramEnd"/>
+      <w:r>
+        <w:rPr>
+          <w:rFonts w:cstheme="minorHAnsi"/>
+        </w:rPr>
+        <w:t xml:space="preserve"> 2014</w:t>
       </w:r>
     </w:p>
     <w:p>
@@ -1469,36 +1477,181 @@
       <w:r>
         <w:tab/>
       </w:r>
-      <w:r>
+    </w:p>
+    <w:p>
+      <w:pPr>
+        <w:pStyle w:val="Heading2"/>
+        <w:rPr>
+          <w:rFonts w:asciiTheme="minorHAnsi" w:hAnsiTheme="minorHAnsi"/>
+          <w:iCs w:val="0"/>
+        </w:rPr>
+      </w:pPr>
+      <w:r>
+        <w:rPr>
+          <w:rFonts w:asciiTheme="minorHAnsi" w:hAnsiTheme="minorHAnsi"/>
+        </w:rPr>
+        <w:drawing>
+          <wp:inline distT="0" distB="0" distL="0" distR="0" wp14:anchorId="2E9B8B34" wp14:editId="59E24025">
+            <wp:extent cx="215036" cy="228600"/>
+            <wp:effectExtent l="0" t="0" r="0" b="0"/>
+            <wp:docPr id="1963834781" name="Picture 4"/>
+            <wp:cNvGraphicFramePr>
+              <a:graphicFrameLocks xmlns:a="http://schemas.openxmlformats.org/drawingml/2006/main" noChangeAspect="1"/>
+            </wp:cNvGraphicFramePr>
+            <a:graphic xmlns:a="http://schemas.openxmlformats.org/drawingml/2006/main">
+              <a:graphicData uri="http://schemas.openxmlformats.org/drawingml/2006/picture">
+                <pic:pic xmlns:pic="http://schemas.openxmlformats.org/drawingml/2006/picture">
+                  <pic:nvPicPr>
+                    <pic:cNvPr id="1963834781" name="Picture 4"/>
+                    <pic:cNvPicPr/>
+                  </pic:nvPicPr>
+                  <pic:blipFill>
+                    <a:blip r:embed="rId20">
+                      <a:extLst>
+                        <a:ext uri="{28A0092B-C50C-407E-A947-70E740481C1C}">
+                          <a14:useLocalDpi xmlns:a14="http://schemas.microsoft.com/office/drawing/2010/main"/>
+                        </a:ext>
+                      </a:extLst>
+                    </a:blip>
+                    <a:stretch>
+                      <a:fillRect/>
+                    </a:stretch>
+                  </pic:blipFill>
+                  <pic:spPr>
+                    <a:xfrm>
+                      <a:off x="0" y="0"/>
+                      <a:ext cx="215036" cy="228600"/>
+                    </a:xfrm>
+                    <a:prstGeom prst="rect">
+                      <a:avLst/>
+                    </a:prstGeom>
+                  </pic:spPr>
+                </pic:pic>
+              </a:graphicData>
+            </a:graphic>
+          </wp:inline>
+        </w:drawing>
+      </w:r>
+      <w:r>
+        <w:rPr>
+          <w:rFonts w:asciiTheme="minorHAnsi" w:hAnsiTheme="minorHAnsi"/>
+        </w:rPr>
+        <w:t xml:space="preserve"> </w:t>
+      </w:r>
+      <w:r>
+        <w:rPr>
+          <w:rStyle w:val="Emphasis"/>
+          <w:color w:val="auto"/>
+          <w:sz w:val="24"/>
+        </w:rPr>
+        <w:t xml:space="preserve">University of </w:t>
+      </w:r>
+      <w:r>
+        <w:rPr>
+          <w:rStyle w:val="Emphasis"/>
+          <w:color w:val="auto"/>
+          <w:sz w:val="24"/>
+        </w:rPr>
+        <w:t>Texas at Austin</w:t>
+      </w:r>
+      <w:r>
+        <w:rPr>
+          <w:rStyle w:val="Emphasis"/>
+          <w:color w:val="auto"/>
+          <w:sz w:val="24"/>
+        </w:rPr>
+        <w:t xml:space="preserve"> - Postdoctoral Fellow</w:t>
+      </w:r>
+      <w:r>
+        <w:rPr>
+          <w:rStyle w:val="Emphasis"/>
+          <w:color w:val="auto"/>
+          <w:sz w:val="24"/>
+        </w:rPr>
         <w:tab/>
-      </w:r>
-      <w:r>
+        <w:t xml:space="preserve">      </w:t>
+      </w:r>
+      <w:r>
+        <w:rPr>
+          <w:rFonts w:asciiTheme="minorHAnsi" w:hAnsiTheme="minorHAnsi"/>
+        </w:rPr>
+        <w:t xml:space="preserve">                              </w:t>
+      </w:r>
+      <w:r>
+        <w:rPr>
+          <w:rFonts w:asciiTheme="minorHAnsi" w:hAnsiTheme="minorHAnsi"/>
+        </w:rPr>
         <w:tab/>
-      </w:r>
-      <w:r>
+        <w:t xml:space="preserve"> </w:t>
+      </w:r>
+      <w:r>
+        <w:rPr>
+          <w:rFonts w:asciiTheme="minorHAnsi" w:hAnsiTheme="minorHAnsi"/>
+        </w:rPr>
         <w:tab/>
+        <w:t>June 202</w:t>
+      </w:r>
+      <w:r>
+        <w:rPr>
+          <w:rFonts w:asciiTheme="minorHAnsi" w:hAnsiTheme="minorHAnsi"/>
+        </w:rPr>
+        <w:t>6</w:t>
+      </w:r>
+      <w:r>
+        <w:rPr>
+          <w:rFonts w:asciiTheme="minorHAnsi" w:hAnsiTheme="minorHAnsi"/>
+        </w:rPr>
+        <w:t xml:space="preserve"> – Present</w:t>
+      </w:r>
+    </w:p>
+    <w:p>
+      <w:pPr>
+        <w:pStyle w:val="ListParagraph"/>
+        <w:numPr>
+          <w:ilvl w:val="0"/>
+          <w:numId w:val="1"/>
+        </w:numPr>
+        <w:tabs>
+          <w:tab w:val="left" w:pos="180"/>
+        </w:tabs>
+        <w:ind w:left="180" w:hanging="180"/>
+        <w:jc w:val="both"/>
+        <w:rPr>
+          <w:rFonts w:cstheme="minorHAnsi"/>
+        </w:rPr>
+      </w:pPr>
+      <w:r>
+        <w:rPr>
+          <w:rFonts w:cstheme="minorHAnsi"/>
+        </w:rPr>
+        <w:t>Developing wet-spun, bio-functional fibers from regenerated cellulose and lignocellulosic biomass for medical-textile applications in the Renewable Fiber and Composite Laboratory.</w:t>
+      </w:r>
+    </w:p>
+    <w:p>
+      <w:pPr>
+        <w:pStyle w:val="ListParagraph"/>
+        <w:numPr>
+          <w:ilvl w:val="0"/>
+          <w:numId w:val="1"/>
+        </w:numPr>
+        <w:tabs>
+          <w:tab w:val="left" w:pos="180"/>
+        </w:tabs>
+        <w:ind w:left="180" w:hanging="180"/>
+        <w:jc w:val="both"/>
+        <w:rPr>
+          <w:rFonts w:cstheme="minorHAnsi"/>
+        </w:rPr>
+      </w:pPr>
+      <w:r>
+        <w:rPr>
+          <w:rFonts w:cstheme="minorHAnsi"/>
+        </w:rPr>
+        <w:t>Applying extrusion-based processing and material characterization expertise (rheology, FTIR, DSC, TGA, mechanical testing) to fiber formation and process optimization.</w:t>
       </w:r>
       <w:r>
         <w:tab/>
       </w:r>
-      <w:r>
-        <w:tab/>
-      </w:r>
-      <w:r>
-        <w:tab/>
-      </w:r>
-      <w:r>
-        <w:tab/>
-      </w:r>
-      <w:r>
-        <w:tab/>
-      </w:r>
-      <w:r>
-        <w:tab/>
-      </w:r>
-      <w:r>
-        <w:tab/>
-      </w:r>
     </w:p>
     <w:p>
       <w:pPr>
@@ -1506,13 +1659,13 @@
       </w:pPr>
       <w:r>
         <w:drawing>
-          <wp:anchor distT="0" distB="0" distL="45720" distR="54610" simplePos="0" relativeHeight="251667456" behindDoc="1" locked="0" layoutInCell="1" allowOverlap="1" wp14:anchorId="074E6E2C" wp14:editId="7D381B66">
+          <wp:anchor distT="0" distB="0" distL="45720" distR="54610" simplePos="0" relativeHeight="251667456" behindDoc="1" locked="0" layoutInCell="1" allowOverlap="1" wp14:anchorId="074E6E2C" wp14:editId="43CB2D98">
             <wp:simplePos x="0" y="0"/>
             <wp:positionH relativeFrom="column">
-              <wp:posOffset>-635</wp:posOffset>
+              <wp:posOffset>32385</wp:posOffset>
             </wp:positionH>
             <wp:positionV relativeFrom="page">
-              <wp:posOffset>5704840</wp:posOffset>
+              <wp:posOffset>6892290</wp:posOffset>
             </wp:positionV>
             <wp:extent cx="118745" cy="228600"/>
             <wp:effectExtent l="0" t="0" r="0" b="0"/>
@@ -1532,7 +1685,7 @@
                     <a:blip r:embed="rId17" cstate="print">
                       <a:extLst>
                         <a:ext uri="{28A0092B-C50C-407E-A947-70E740481C1C}">
-                          <a14:useLocalDpi xmlns:a14="http://schemas.microsoft.com/office/drawing/2010/main" val="0"/>
+                          <a14:useLocalDpi xmlns:a14="http://schemas.microsoft.com/office/drawing/2010/main"/>
                         </a:ext>
                       </a:extLst>
                     </a:blip>
@@ -1827,14 +1980,15 @@
         </w:rPr>
       </w:pPr>
       <w:r>
+        <w:lastRenderedPageBreak/>
         <w:drawing>
-          <wp:anchor distT="0" distB="0" distL="114300" distR="54610" simplePos="0" relativeHeight="251668480" behindDoc="0" locked="0" layoutInCell="1" allowOverlap="1" wp14:anchorId="611BB9DB" wp14:editId="219F9F65">
+          <wp:anchor distT="0" distB="0" distL="114300" distR="54610" simplePos="0" relativeHeight="251668480" behindDoc="0" locked="0" layoutInCell="1" allowOverlap="1" wp14:anchorId="611BB9DB" wp14:editId="58A27E6D">
             <wp:simplePos x="0" y="0"/>
             <wp:positionH relativeFrom="column">
-              <wp:posOffset>-14605</wp:posOffset>
+              <wp:posOffset>-49530</wp:posOffset>
             </wp:positionH>
             <wp:positionV relativeFrom="paragraph">
-              <wp:posOffset>102870</wp:posOffset>
+              <wp:posOffset>0</wp:posOffset>
             </wp:positionV>
             <wp:extent cx="173736" cy="234697"/>
             <wp:effectExtent l="0" t="0" r="0" b="0"/>
@@ -1851,10 +2005,10 @@
                     <pic:cNvPicPr/>
                   </pic:nvPicPr>
                   <pic:blipFill>
-                    <a:blip r:embed="rId20" cstate="print">
+                    <a:blip r:embed="rId21" cstate="print">
                       <a:extLst>
                         <a:ext uri="{28A0092B-C50C-407E-A947-70E740481C1C}">
-                          <a14:useLocalDpi xmlns:a14="http://schemas.microsoft.com/office/drawing/2010/main" val="0"/>
+                          <a14:useLocalDpi xmlns:a14="http://schemas.microsoft.com/office/drawing/2010/main"/>
                         </a:ext>
                       </a:extLst>
                     </a:blip>
@@ -2020,15 +2174,14 @@
         </w:rPr>
       </w:pPr>
       <w:r>
-        <w:lastRenderedPageBreak/>
         <w:drawing>
-          <wp:anchor distT="0" distB="0" distL="114300" distR="54610" simplePos="0" relativeHeight="251670528" behindDoc="0" locked="0" layoutInCell="1" allowOverlap="1" wp14:anchorId="2B8DBAEF" wp14:editId="522D05C1">
+          <wp:anchor distT="0" distB="0" distL="114300" distR="54610" simplePos="0" relativeHeight="251670528" behindDoc="0" locked="0" layoutInCell="1" allowOverlap="1" wp14:anchorId="2B8DBAEF" wp14:editId="4CEDC4C4">
             <wp:simplePos x="0" y="0"/>
             <wp:positionH relativeFrom="column">
-              <wp:posOffset>9720</wp:posOffset>
+              <wp:posOffset>3175</wp:posOffset>
             </wp:positionH>
             <wp:positionV relativeFrom="page">
-              <wp:posOffset>356530</wp:posOffset>
+              <wp:posOffset>2000885</wp:posOffset>
             </wp:positionV>
             <wp:extent cx="182880" cy="225425"/>
             <wp:effectExtent l="0" t="0" r="7620" b="3175"/>
@@ -2048,7 +2201,7 @@
                     <a:blip r:embed="rId18" cstate="print">
                       <a:extLst>
                         <a:ext uri="{28A0092B-C50C-407E-A947-70E740481C1C}">
-                          <a14:useLocalDpi xmlns:a14="http://schemas.microsoft.com/office/drawing/2010/main" val="0"/>
+                          <a14:useLocalDpi xmlns:a14="http://schemas.microsoft.com/office/drawing/2010/main"/>
                         </a:ext>
                       </a:extLst>
                     </a:blip>
@@ -2177,7 +2330,21 @@
         <w:rPr>
           <w:rFonts w:cstheme="minorHAnsi"/>
         </w:rPr>
-        <w:t xml:space="preserve"> a novel cooling system for Re3D’s Gigabot-X 3D printer, resulting in a </w:t>
+        <w:t xml:space="preserve"> a novel cooling system for Re3D’s </w:t>
+      </w:r>
+      <w:proofErr w:type="spellStart"/>
+      <w:r>
+        <w:rPr>
+          <w:rFonts w:cstheme="minorHAnsi"/>
+        </w:rPr>
+        <w:t>Gigabot</w:t>
+      </w:r>
+      <w:proofErr w:type="spellEnd"/>
+      <w:r>
+        <w:rPr>
+          <w:rFonts w:cstheme="minorHAnsi"/>
+        </w:rPr>
+        <w:t xml:space="preserve">-X 3D printer, resulting in a </w:t>
       </w:r>
       <w:r>
         <w:rPr>
@@ -2353,7 +2520,21 @@
         <w:rPr>
           <w:rFonts w:cstheme="minorHAnsi"/>
         </w:rPr>
-        <w:t>Developed a novel composite via injection molding from waste Acrylonitrile Styrene Acrylate (ASA) and hazardous stamp sand (40% mass) that achieved a tensile strength comparable to virgin Acrylonitrile Butadiene Styrene (ABS), offering a remediation strategy for 500M tons of toxic waste</w:t>
+        <w:t xml:space="preserve">Developed a novel composite via injection molding from waste Acrylonitrile Styrene Acrylate (ASA) and hazardous stamp sand (40% mass) that achieved a tensile strength comparable to virgin Acrylonitrile </w:t>
+      </w:r>
+      <w:proofErr w:type="gramStart"/>
+      <w:r>
+        <w:rPr>
+          <w:rFonts w:cstheme="minorHAnsi"/>
+        </w:rPr>
+        <w:t>Butadiene Styrene</w:t>
+      </w:r>
+      <w:proofErr w:type="gramEnd"/>
+      <w:r>
+        <w:rPr>
+          <w:rFonts w:cstheme="minorHAnsi"/>
+        </w:rPr>
+        <w:t xml:space="preserve"> (ABS), offering a remediation strategy for 500M tons of toxic waste</w:t>
       </w:r>
       <w:r>
         <w:rPr>
@@ -2507,7 +2688,21 @@
         <w:rPr>
           <w:rFonts w:cstheme="minorHAnsi"/>
         </w:rPr>
-        <w:t>Design for Manufacturing (DfM), Laser Cutting, and CNC machining</w:t>
+        <w:t>Design for Manufacturing (</w:t>
+      </w:r>
+      <w:proofErr w:type="spellStart"/>
+      <w:r>
+        <w:rPr>
+          <w:rFonts w:cstheme="minorHAnsi"/>
+        </w:rPr>
+        <w:t>DfM</w:t>
+      </w:r>
+      <w:proofErr w:type="spellEnd"/>
+      <w:r>
+        <w:rPr>
+          <w:rFonts w:cstheme="minorHAnsi"/>
+        </w:rPr>
+        <w:t>), Laser Cutting, and CNC machining</w:t>
       </w:r>
       <w:r>
         <w:rPr>
@@ -2833,150 +3028,6 @@
     </w:p>
     <w:p>
       <w:pPr>
-        <w:pStyle w:val="ListParagraph"/>
-        <w:tabs>
-          <w:tab w:val="left" w:pos="360"/>
-        </w:tabs>
-        <w:spacing w:after="100"/>
-        <w:ind w:left="180"/>
-        <w:jc w:val="both"/>
-        <w:rPr>
-          <w:rFonts w:cstheme="minorHAnsi"/>
-          <w:sz w:val="22"/>
-          <w:szCs w:val="22"/>
-        </w:rPr>
-      </w:pPr>
-    </w:p>
-    <w:p>
-      <w:pPr>
-        <w:pStyle w:val="ListParagraph"/>
-        <w:tabs>
-          <w:tab w:val="left" w:pos="360"/>
-        </w:tabs>
-        <w:spacing w:after="100"/>
-        <w:ind w:left="180"/>
-        <w:jc w:val="both"/>
-        <w:rPr>
-          <w:rFonts w:cstheme="minorHAnsi"/>
-          <w:sz w:val="22"/>
-          <w:szCs w:val="22"/>
-        </w:rPr>
-      </w:pPr>
-    </w:p>
-    <w:p>
-      <w:pPr>
-        <w:pStyle w:val="ListParagraph"/>
-        <w:tabs>
-          <w:tab w:val="left" w:pos="360"/>
-        </w:tabs>
-        <w:spacing w:after="100"/>
-        <w:ind w:left="180"/>
-        <w:jc w:val="both"/>
-        <w:rPr>
-          <w:rFonts w:cstheme="minorHAnsi"/>
-          <w:sz w:val="22"/>
-          <w:szCs w:val="22"/>
-        </w:rPr>
-      </w:pPr>
-    </w:p>
-    <w:p>
-      <w:pPr>
-        <w:pStyle w:val="ListParagraph"/>
-        <w:tabs>
-          <w:tab w:val="left" w:pos="360"/>
-        </w:tabs>
-        <w:spacing w:after="100"/>
-        <w:ind w:left="180"/>
-        <w:jc w:val="both"/>
-        <w:rPr>
-          <w:rFonts w:cstheme="minorHAnsi"/>
-          <w:sz w:val="22"/>
-          <w:szCs w:val="22"/>
-        </w:rPr>
-      </w:pPr>
-    </w:p>
-    <w:p>
-      <w:pPr>
-        <w:pStyle w:val="ListParagraph"/>
-        <w:tabs>
-          <w:tab w:val="left" w:pos="360"/>
-        </w:tabs>
-        <w:spacing w:after="100"/>
-        <w:ind w:left="180"/>
-        <w:jc w:val="both"/>
-        <w:rPr>
-          <w:rFonts w:cstheme="minorHAnsi"/>
-          <w:sz w:val="22"/>
-          <w:szCs w:val="22"/>
-        </w:rPr>
-      </w:pPr>
-    </w:p>
-    <w:p>
-      <w:pPr>
-        <w:pStyle w:val="ListParagraph"/>
-        <w:tabs>
-          <w:tab w:val="left" w:pos="360"/>
-        </w:tabs>
-        <w:spacing w:after="100"/>
-        <w:ind w:left="180"/>
-        <w:jc w:val="both"/>
-        <w:rPr>
-          <w:rFonts w:cstheme="minorHAnsi"/>
-          <w:sz w:val="22"/>
-          <w:szCs w:val="22"/>
-        </w:rPr>
-      </w:pPr>
-    </w:p>
-    <w:p>
-      <w:pPr>
-        <w:pStyle w:val="ListParagraph"/>
-        <w:tabs>
-          <w:tab w:val="left" w:pos="360"/>
-        </w:tabs>
-        <w:spacing w:after="100"/>
-        <w:ind w:left="180"/>
-        <w:jc w:val="both"/>
-        <w:rPr>
-          <w:rFonts w:cstheme="minorHAnsi"/>
-          <w:sz w:val="22"/>
-          <w:szCs w:val="22"/>
-        </w:rPr>
-      </w:pPr>
-    </w:p>
-    <w:p>
-      <w:pPr>
-        <w:pStyle w:val="ListParagraph"/>
-        <w:tabs>
-          <w:tab w:val="left" w:pos="360"/>
-        </w:tabs>
-        <w:spacing w:after="100"/>
-        <w:ind w:left="180"/>
-        <w:jc w:val="both"/>
-        <w:rPr>
-          <w:rFonts w:cstheme="minorHAnsi"/>
-          <w:sz w:val="22"/>
-          <w:szCs w:val="22"/>
-        </w:rPr>
-      </w:pPr>
-    </w:p>
-    <w:p>
-      <w:pPr>
-        <w:pStyle w:val="ListParagraph"/>
-        <w:tabs>
-          <w:tab w:val="left" w:pos="360"/>
-        </w:tabs>
-        <w:spacing w:after="100"/>
-        <w:ind w:left="180"/>
-        <w:jc w:val="both"/>
-        <w:rPr>
-          <w:rFonts w:cstheme="minorHAnsi"/>
-          <w:sz w:val="22"/>
-          <w:szCs w:val="22"/>
-        </w:rPr>
-      </w:pPr>
-    </w:p>
-    <w:p>
-      <w:pPr>
         <w:pStyle w:val="Heading1"/>
       </w:pPr>
       <w:r>
@@ -3432,7 +3483,31 @@
           <w:color w:val="auto"/>
           <w:u w:val="none"/>
         </w:rPr>
-        <w:t>Partially RepRapable automated open-source bag valve mask-based ventilator (2020)</w:t>
+        <w:t xml:space="preserve">Partially </w:t>
+      </w:r>
+      <w:proofErr w:type="spellStart"/>
+      <w:r>
+        <w:rPr>
+          <w:rStyle w:val="Hyperlink"/>
+          <w:rFonts w:eastAsia="CenturyGothic-Bold" w:cstheme="minorHAnsi"/>
+          <w:b/>
+          <w:bCs/>
+          <w:color w:val="auto"/>
+          <w:u w:val="none"/>
+        </w:rPr>
+        <w:t>RepRapable</w:t>
+      </w:r>
+      <w:proofErr w:type="spellEnd"/>
+      <w:r>
+        <w:rPr>
+          <w:rStyle w:val="Hyperlink"/>
+          <w:rFonts w:eastAsia="CenturyGothic-Bold" w:cstheme="minorHAnsi"/>
+          <w:b/>
+          <w:bCs/>
+          <w:color w:val="auto"/>
+          <w:u w:val="none"/>
+        </w:rPr>
+        <w:t xml:space="preserve"> automated open-source bag valve mask-based ventilator (2020)</w:t>
       </w:r>
     </w:p>
     <w:p>
@@ -3452,7 +3527,67 @@
           <w:color w:val="auto"/>
           <w:u w:val="none"/>
         </w:rPr>
-        <w:t>A Petsiuk, NG Tanikella, S Dertinger, A Pringle, S Oberloier, JM Pearce. HardwareX 8, e00131</w:t>
+        <w:t xml:space="preserve">A </w:t>
+      </w:r>
+      <w:proofErr w:type="spellStart"/>
+      <w:r>
+        <w:rPr>
+          <w:rStyle w:val="Hyperlink"/>
+          <w:rFonts w:eastAsia="CenturyGothic" w:cstheme="minorHAnsi"/>
+          <w:color w:val="auto"/>
+          <w:u w:val="none"/>
+        </w:rPr>
+        <w:t>Petsiuk</w:t>
+      </w:r>
+      <w:proofErr w:type="spellEnd"/>
+      <w:r>
+        <w:rPr>
+          <w:rStyle w:val="Hyperlink"/>
+          <w:rFonts w:eastAsia="CenturyGothic" w:cstheme="minorHAnsi"/>
+          <w:color w:val="auto"/>
+          <w:u w:val="none"/>
+        </w:rPr>
+        <w:t xml:space="preserve">, NG Tanikella, S Dertinger, A Pringle, S </w:t>
+      </w:r>
+      <w:proofErr w:type="spellStart"/>
+      <w:r>
+        <w:rPr>
+          <w:rStyle w:val="Hyperlink"/>
+          <w:rFonts w:eastAsia="CenturyGothic" w:cstheme="minorHAnsi"/>
+          <w:color w:val="auto"/>
+          <w:u w:val="none"/>
+        </w:rPr>
+        <w:t>Oberloier</w:t>
+      </w:r>
+      <w:proofErr w:type="spellEnd"/>
+      <w:r>
+        <w:rPr>
+          <w:rStyle w:val="Hyperlink"/>
+          <w:rFonts w:eastAsia="CenturyGothic" w:cstheme="minorHAnsi"/>
+          <w:color w:val="auto"/>
+          <w:u w:val="none"/>
+        </w:rPr>
+        <w:t xml:space="preserve">, JM Pearce. </w:t>
+      </w:r>
+      <w:proofErr w:type="spellStart"/>
+      <w:r>
+        <w:rPr>
+          <w:rStyle w:val="Hyperlink"/>
+          <w:rFonts w:eastAsia="CenturyGothic" w:cstheme="minorHAnsi"/>
+          <w:color w:val="auto"/>
+          <w:u w:val="none"/>
+        </w:rPr>
+        <w:t>HardwareX</w:t>
+      </w:r>
+      <w:proofErr w:type="spellEnd"/>
+      <w:r>
+        <w:rPr>
+          <w:rStyle w:val="Hyperlink"/>
+          <w:rFonts w:eastAsia="CenturyGothic" w:cstheme="minorHAnsi"/>
+          <w:color w:val="auto"/>
+          <w:u w:val="none"/>
+        </w:rPr>
+        <w:t xml:space="preserve"> 8, e00131</w:t>
       </w:r>
       <w:r>
         <w:rPr>
@@ -3544,7 +3679,27 @@
           <w:color w:val="auto"/>
           <w:u w:val="none"/>
         </w:rPr>
-        <w:t>NG Skrzypczak, NG Tanikella, JM Pearce. HardwareX 8, e00130</w:t>
+        <w:t xml:space="preserve">NG Skrzypczak, NG Tanikella, JM Pearce. </w:t>
+      </w:r>
+      <w:proofErr w:type="spellStart"/>
+      <w:r>
+        <w:rPr>
+          <w:rStyle w:val="Hyperlink"/>
+          <w:rFonts w:eastAsia="CenturyGothic" w:cstheme="minorHAnsi"/>
+          <w:color w:val="auto"/>
+          <w:u w:val="none"/>
+        </w:rPr>
+        <w:t>HardwareX</w:t>
+      </w:r>
+      <w:proofErr w:type="spellEnd"/>
+      <w:r>
+        <w:rPr>
+          <w:rStyle w:val="Hyperlink"/>
+          <w:rFonts w:eastAsia="CenturyGothic" w:cstheme="minorHAnsi"/>
+          <w:color w:val="auto"/>
+          <w:u w:val="none"/>
+        </w:rPr>
+        <w:t xml:space="preserve"> 8, e00130</w:t>
       </w:r>
       <w:r>
         <w:rPr>
@@ -3616,7 +3771,31 @@
           <w:color w:val="auto"/>
           <w:u w:val="none"/>
         </w:rPr>
-        <w:t>Parametric nasopharyngeal swab for sampling COVID-19 and other respiratory viruses:  Open-source design, SLA 3-D printing and UV curing system (2020)</w:t>
+        <w:t>Parametric nasopharyngeal swab for sampling COVID-19 and other respiratory viruses</w:t>
+      </w:r>
+      <w:proofErr w:type="gramStart"/>
+      <w:r>
+        <w:rPr>
+          <w:rStyle w:val="Hyperlink"/>
+          <w:rFonts w:eastAsia="CenturyGothic-Bold" w:cstheme="minorHAnsi"/>
+          <w:b/>
+          <w:bCs/>
+          <w:color w:val="auto"/>
+          <w:u w:val="none"/>
+        </w:rPr>
+        <w:t>:  Open</w:t>
+      </w:r>
+      <w:proofErr w:type="gramEnd"/>
+      <w:r>
+        <w:rPr>
+          <w:rStyle w:val="Hyperlink"/>
+          <w:rFonts w:eastAsia="CenturyGothic-Bold" w:cstheme="minorHAnsi"/>
+          <w:b/>
+          <w:bCs/>
+          <w:color w:val="auto"/>
+          <w:u w:val="none"/>
+        </w:rPr>
+        <w:t>-source design, SLA 3-D printing and UV curing system (2020)</w:t>
       </w:r>
     </w:p>
     <w:p>
@@ -3636,7 +3815,47 @@
           <w:color w:val="auto"/>
           <w:u w:val="none"/>
         </w:rPr>
-        <w:t>N Gallup, AM Pringle, S Oberloier, NG Tanikella, JM Pearce. HardwareX 8, e00135</w:t>
+        <w:t xml:space="preserve">N Gallup, AM Pringle, S </w:t>
+      </w:r>
+      <w:proofErr w:type="spellStart"/>
+      <w:r>
+        <w:rPr>
+          <w:rStyle w:val="Hyperlink"/>
+          <w:rFonts w:eastAsia="CenturyGothic" w:cstheme="minorHAnsi"/>
+          <w:color w:val="auto"/>
+          <w:u w:val="none"/>
+        </w:rPr>
+        <w:t>Oberloier</w:t>
+      </w:r>
+      <w:proofErr w:type="spellEnd"/>
+      <w:r>
+        <w:rPr>
+          <w:rStyle w:val="Hyperlink"/>
+          <w:rFonts w:eastAsia="CenturyGothic" w:cstheme="minorHAnsi"/>
+          <w:color w:val="auto"/>
+          <w:u w:val="none"/>
+        </w:rPr>
+        <w:t xml:space="preserve">, NG Tanikella, JM Pearce. </w:t>
+      </w:r>
+      <w:proofErr w:type="spellStart"/>
+      <w:r>
+        <w:rPr>
+          <w:rStyle w:val="Hyperlink"/>
+          <w:rFonts w:eastAsia="CenturyGothic" w:cstheme="minorHAnsi"/>
+          <w:color w:val="auto"/>
+          <w:u w:val="none"/>
+        </w:rPr>
+        <w:t>HardwareX</w:t>
+      </w:r>
+      <w:proofErr w:type="spellEnd"/>
+      <w:r>
+        <w:rPr>
+          <w:rStyle w:val="Hyperlink"/>
+          <w:rFonts w:eastAsia="CenturyGothic" w:cstheme="minorHAnsi"/>
+          <w:color w:val="auto"/>
+          <w:u w:val="none"/>
+        </w:rPr>
+        <w:t xml:space="preserve"> 8, e00135</w:t>
       </w:r>
       <w:r>
         <w:rPr>
@@ -3728,7 +3947,27 @@
           <w:color w:val="auto"/>
           <w:u w:val="none"/>
         </w:rPr>
-        <w:t>HA Little, NG Tanikella, M J Reich, MJ Fiedler, SL Snabes, JM Pearce. Materials 13 (19), 4273</w:t>
+        <w:t xml:space="preserve">HA Little, NG Tanikella, M J Reich, MJ Fiedler, SL </w:t>
+      </w:r>
+      <w:proofErr w:type="spellStart"/>
+      <w:r>
+        <w:rPr>
+          <w:rStyle w:val="Hyperlink"/>
+          <w:rFonts w:eastAsia="CenturyGothic" w:cstheme="minorHAnsi"/>
+          <w:color w:val="auto"/>
+          <w:u w:val="none"/>
+        </w:rPr>
+        <w:t>Snabes</w:t>
+      </w:r>
+      <w:proofErr w:type="spellEnd"/>
+      <w:r>
+        <w:rPr>
+          <w:rStyle w:val="Hyperlink"/>
+          <w:rFonts w:eastAsia="CenturyGothic" w:cstheme="minorHAnsi"/>
+          <w:color w:val="auto"/>
+          <w:u w:val="none"/>
+        </w:rPr>
+        <w:t>, JM Pearce. Materials 13 (19), 4273</w:t>
       </w:r>
       <w:r>
         <w:rPr>
@@ -4004,7 +4243,27 @@
           <w:color w:val="auto"/>
           <w:u w:val="none"/>
         </w:rPr>
-        <w:t>MJ Reich, AL Woern, NG Tanikella, JM Pearce. Materials 12 (10), 1642</w:t>
+        <w:t xml:space="preserve">MJ Reich, AL </w:t>
+      </w:r>
+      <w:proofErr w:type="spellStart"/>
+      <w:r>
+        <w:rPr>
+          <w:rStyle w:val="Hyperlink"/>
+          <w:rFonts w:eastAsia="CenturyGothic" w:cstheme="minorHAnsi"/>
+          <w:color w:val="auto"/>
+          <w:u w:val="none"/>
+        </w:rPr>
+        <w:t>Woern</w:t>
+      </w:r>
+      <w:proofErr w:type="spellEnd"/>
+      <w:r>
+        <w:rPr>
+          <w:rStyle w:val="Hyperlink"/>
+          <w:rFonts w:eastAsia="CenturyGothic" w:cstheme="minorHAnsi"/>
+          <w:color w:val="auto"/>
+          <w:u w:val="none"/>
+        </w:rPr>
+        <w:t>, NG Tanikella, JM Pearce. Materials 12 (10), 1642</w:t>
       </w:r>
       <w:r>
         <w:rPr>
@@ -4076,7 +4335,31 @@
           <w:color w:val="auto"/>
           <w:u w:val="none"/>
         </w:rPr>
-        <w:t>Viability of distributed manufacturing of bicycle components with 3-D printing: CEN standardized polylactic acid pedal testing (2017)</w:t>
+        <w:t xml:space="preserve">Viability of distributed </w:t>
+      </w:r>
+      <w:proofErr w:type="gramStart"/>
+      <w:r>
+        <w:rPr>
+          <w:rStyle w:val="Hyperlink"/>
+          <w:rFonts w:eastAsia="CenturyGothic-Bold" w:cstheme="minorHAnsi"/>
+          <w:b/>
+          <w:bCs/>
+          <w:color w:val="auto"/>
+          <w:u w:val="none"/>
+        </w:rPr>
+        <w:t>manufacturing of</w:t>
+      </w:r>
+      <w:proofErr w:type="gramEnd"/>
+      <w:r>
+        <w:rPr>
+          <w:rStyle w:val="Hyperlink"/>
+          <w:rFonts w:eastAsia="CenturyGothic-Bold" w:cstheme="minorHAnsi"/>
+          <w:b/>
+          <w:bCs/>
+          <w:color w:val="auto"/>
+          <w:u w:val="none"/>
+        </w:rPr>
+        <w:t xml:space="preserve"> bicycle components with 3-D printing: CEN standardized polylactic acid pedal testing (2017)</w:t>
       </w:r>
     </w:p>
     <w:p>
@@ -4096,7 +4379,27 @@
           <w:color w:val="auto"/>
           <w:u w:val="none"/>
         </w:rPr>
-        <w:t>NG Tanikella, J Gershenson, B Savonen, JM Pearce. Journal of Humanitarian Engineering</w:t>
+        <w:t xml:space="preserve">NG Tanikella, J Gershenson, B </w:t>
+      </w:r>
+      <w:proofErr w:type="spellStart"/>
+      <w:r>
+        <w:rPr>
+          <w:rStyle w:val="Hyperlink"/>
+          <w:rFonts w:eastAsia="CenturyGothic" w:cstheme="minorHAnsi"/>
+          <w:color w:val="auto"/>
+          <w:u w:val="none"/>
+        </w:rPr>
+        <w:t>Savonen</w:t>
+      </w:r>
+      <w:proofErr w:type="spellEnd"/>
+      <w:r>
+        <w:rPr>
+          <w:rStyle w:val="Hyperlink"/>
+          <w:rFonts w:eastAsia="CenturyGothic" w:cstheme="minorHAnsi"/>
+          <w:color w:val="auto"/>
+          <w:u w:val="none"/>
+        </w:rPr>
+        <w:t>, JM Pearce. Journal of Humanitarian Engineering</w:t>
       </w:r>
       <w:r>
         <w:rPr>
@@ -5346,7 +5649,7 @@
           <w:bCs/>
         </w:rPr>
         <w:sectPr>
-          <w:footerReference w:type="default" r:id="rId21"/>
+          <w:footerReference w:type="default" r:id="rId22"/>
           <w:pgSz w:w="12240" w:h="15840"/>
           <w:pgMar w:top="576" w:right="720" w:bottom="576" w:left="720" w:header="720" w:footer="432" w:gutter="0"/>
           <w:cols w:space="720"/>
@@ -5404,7 +5707,7 @@
         </w:tabs>
         <w:spacing w:after="80"/>
       </w:pPr>
-      <w:hyperlink r:id="rId22" w:history="1">
+      <w:hyperlink r:id="rId23" w:history="1">
         <w:r>
           <w:rPr>
             <w:rStyle w:val="Hyperlink"/>
@@ -5481,7 +5784,7 @@
         </w:tabs>
         <w:spacing w:after="80"/>
       </w:pPr>
-      <w:hyperlink r:id="rId23" w:history="1">
+      <w:hyperlink r:id="rId24" w:history="1">
         <w:r>
           <w:rPr>
             <w:rStyle w:val="Hyperlink"/>
@@ -5517,12 +5820,21 @@
           <w:bCs/>
         </w:rPr>
       </w:pPr>
-      <w:r>
-        <w:rPr>
-          <w:b/>
-          <w:bCs/>
-        </w:rPr>
-        <w:t>Xianhui Zhao</w:t>
+      <w:proofErr w:type="spellStart"/>
+      <w:r>
+        <w:rPr>
+          <w:b/>
+          <w:bCs/>
+        </w:rPr>
+        <w:t>Xianhui</w:t>
+      </w:r>
+      <w:proofErr w:type="spellEnd"/>
+      <w:r>
+        <w:rPr>
+          <w:b/>
+          <w:bCs/>
+        </w:rPr>
+        <w:t xml:space="preserve"> Zhao</w:t>
       </w:r>
     </w:p>
     <w:p>
@@ -5560,7 +5872,7 @@
         </w:tabs>
         <w:spacing w:after="80"/>
       </w:pPr>
-      <w:hyperlink r:id="rId24" w:history="1">
+      <w:hyperlink r:id="rId25" w:history="1">
         <w:r>
           <w:rPr>
             <w:rStyle w:val="Hyperlink"/>
@@ -5629,8 +5941,30 @@
         <w:rPr>
           <w:lang w:val="fr-FR"/>
         </w:rPr>
-        <w:t>Professor, Michigan Technological University</w:t>
-      </w:r>
+        <w:t xml:space="preserve">Professor, Michigan </w:t>
+      </w:r>
+      <w:proofErr w:type="spellStart"/>
+      <w:r>
+        <w:rPr>
+          <w:lang w:val="fr-FR"/>
+        </w:rPr>
+        <w:t>Technological</w:t>
+      </w:r>
+      <w:proofErr w:type="spellEnd"/>
+      <w:r>
+        <w:rPr>
+          <w:lang w:val="fr-FR"/>
+        </w:rPr>
+        <w:t xml:space="preserve"> </w:t>
+      </w:r>
+      <w:proofErr w:type="spellStart"/>
+      <w:r>
+        <w:rPr>
+          <w:lang w:val="fr-FR"/>
+        </w:rPr>
+        <w:t>University</w:t>
+      </w:r>
+      <w:proofErr w:type="spellEnd"/>
     </w:p>
     <w:p>
       <w:pPr>
@@ -5660,7 +5994,7 @@
           <w:lang w:val="fr-FR"/>
         </w:rPr>
       </w:pPr>
-      <w:hyperlink r:id="rId25" w:history="1">
+      <w:hyperlink r:id="rId26" w:history="1">
         <w:r>
           <w:rPr>
             <w:rStyle w:val="Hyperlink"/>

</xml_diff>